<commit_message>
Log lengkap dari berkas sesi asli (thinking+tool verbatim) + ekspor Word ulang
- Transkrip otomatis 1,6 MB dari chat-messages.json (200 thinking, 397 tool)
- log-mentah.docx kini memuat transkrip lengkap (21.727 paragraf, terverifikasi)
- AGENT.docx (prompt v1+v2) & 8 arsip (ARSIP) diregenerasi

🤖 Generated with Codebuff
Co-Authored-By: Codebuff <noreply@codebuff.com>
</commit_message>
<xml_diff>
--- a/docs/word-arsip/(ARSIP) laporan-kerja-prompt-2.docx
+++ b/docs/word-arsip/(ARSIP) laporan-kerja-prompt-2.docx
@@ -576,6 +576,718 @@
         <w:t xml:space="preserve">  bukan dengan melemahkan pemeriksaan.</w:t>
       </w:r>
     </w:p>
+    <w:p>
+      <w:r/>
+    </w:p>
+    <w:p>
+      <w:r>
+        <w:t>────────────────────────────────────────</w:t>
+      </w:r>
+    </w:p>
+    <w:p>
+      <w:r/>
+    </w:p>
+    <w:p>
+      <w:pPr>
+        <w:pStyle w:val="Heading2"/>
+      </w:pPr>
+      <w:r>
+        <w:t>2026-10-05 ±19:5x WIB — Permintaan pengguna: mulai fitur asli</w:t>
+      </w:r>
+    </w:p>
+    <w:p>
+      <w:r/>
+    </w:p>
+    <w:p>
+      <w:r>
+        <w:t>Pengguna: "Sekarang mulai buat fitur aslinya sesuai di dokumentasinya" → dimulai</w:t>
+      </w:r>
+    </w:p>
+    <w:p>
+      <w:r>
+        <w:t>**slice 01 (auth &amp; identitas)** sesuai chunks/slice-01.json. Ini masuk cakupan</w:t>
+      </w:r>
+    </w:p>
+    <w:p>
+      <w:r>
+        <w:t>**entri jurnal 2** (auth, sekolah &amp; kelas, bank soal — slice 01-03).</w:t>
+      </w:r>
+    </w:p>
+    <w:p>
+      <w:r/>
+    </w:p>
+    <w:p>
+      <w:pPr>
+        <w:pStyle w:val="Heading3"/>
+      </w:pPr>
+      <w:r>
+        <w:t>19:5x — Langkah 1: migration + seeder + model (DIEKSEKUSI, hasil OK)</w:t>
+      </w:r>
+    </w:p>
+    <w:p>
+      <w:r/>
+    </w:p>
+    <w:p>
+      <w:pPr>
+        <w:pStyle w:val="ListBullet"/>
+      </w:pPr>
+      <w:r>
+        <w:t>`php artisan make:migration add_auth_fields_to_users_table` →</w:t>
+      </w:r>
+    </w:p>
+    <w:p>
+      <w:r>
+        <w:t xml:space="preserve">  berkas dibuat: add_status_role_fields_to_users_table (rename manual);</w:t>
+      </w:r>
+    </w:p>
+    <w:p>
+      <w:r>
+        <w:t xml:space="preserve">  ditulis: status (string default 'pending'), role (string nullable),</w:t>
+      </w:r>
+    </w:p>
+    <w:p>
+      <w:r>
+        <w:t xml:space="preserve">  unique index (role, name) pada tabel roles.</w:t>
+      </w:r>
+    </w:p>
+    <w:p>
+      <w:pPr>
+        <w:pStyle w:val="ListBullet"/>
+      </w:pPr>
+      <w:r>
+        <w:t>`php artisan make:seeder RolesAndAdminSeeder` → berkas dibuat, lalu ditulis</w:t>
+      </w:r>
+    </w:p>
+    <w:p>
+      <w:r>
+        <w:t xml:space="preserve">  penuh: Role::findOrCreate('admin'/'guru'/'murid'), Role::findOrCreate('murid');</w:t>
+      </w:r>
+    </w:p>
+    <w:p>
+      <w:r>
+        <w:t xml:space="preserve">  admin: Admin Sekolah / admin@sekolah.test / Passw0rd!Langsung (Argon2id).</w:t>
+      </w:r>
+    </w:p>
+    <w:p>
+      <w:pPr>
+        <w:pStyle w:val="ListBullet"/>
+      </w:pPr>
+      <w:r>
+        <w:t>app/Sections/Auth/Enums/UserStatus.php DIBUAT: enum string</w:t>
+      </w:r>
+    </w:p>
+    <w:p>
+      <w:r>
+        <w:t xml:space="preserve">  pending/aktif/suspended/dihapus + method label() untuk UI.</w:t>
+      </w:r>
+    </w:p>
+    <w:p>
+      <w:pPr>
+        <w:pStyle w:val="ListBullet"/>
+      </w:pPr>
+      <w:r>
+        <w:t>app/Models/User.php DITULIS ULANG: mass assignment (guard), hidden,</w:t>
+      </w:r>
+    </w:p>
+    <w:p>
+      <w:r>
+        <w:t xml:space="preserve">  cast role &amp; UserStatus, factory; method isGuru() &amp; isMurid();</w:t>
+      </w:r>
+    </w:p>
+    <w:p>
+      <w:r>
+        <w:t xml:space="preserve">  helper akunDitolak() &amp; label akunDitolak() untuk blokir akun.</w:t>
+      </w:r>
+    </w:p>
+    <w:p>
+      <w:pPr>
+        <w:pStyle w:val="ListBullet"/>
+      </w:pPr>
+      <w:r>
+        <w:t>database/factories/UserFactory.php DITULIS: password bawaan, status default,</w:t>
+      </w:r>
+    </w:p>
+    <w:p>
+      <w:r>
+        <w:t xml:space="preserve">  states suspended() dan unverified().</w:t>
+      </w:r>
+    </w:p>
+    <w:p>
+      <w:pPr>
+        <w:pStyle w:val="ListBullet"/>
+      </w:pPr>
+      <w:r>
+        <w:t>Komando: php artisan make:migration ... &amp;&amp; php artisan make:seeder ...</w:t>
+      </w:r>
+    </w:p>
+    <w:p>
+      <w:r>
+        <w:t xml:space="preserve">  (exit 0, berkas muncul di database/migrations dan database/seeders).</w:t>
+      </w:r>
+    </w:p>
+    <w:p>
+      <w:pPr>
+        <w:pStyle w:val="ListBullet"/>
+      </w:pPr>
+      <w:r>
+        <w:t>Migration &amp; seeder ini dijalankan pada saat pengujian fitur (php artisan test</w:t>
+      </w:r>
+    </w:p>
+    <w:p>
+      <w:r>
+        <w:t xml:space="preserve">  dengan RefreshDatabase) — status: ditulis, dijalankan lewat test di langkah 4.</w:t>
+      </w:r>
+    </w:p>
+    <w:p>
+      <w:r/>
+    </w:p>
+    <w:p>
+      <w:r>
+        <w:t>Langkah berikutnya: middleware + rate limiter + service + controller + routes +</w:t>
+      </w:r>
+    </w:p>
+    <w:p>
+      <w:r>
+        <w:t>notification + Pest, lalu frontend.</w:t>
+      </w:r>
+    </w:p>
+    <w:p>
+      <w:r>
+        <w:t>────────────────────────────────────────</w:t>
+      </w:r>
+    </w:p>
+    <w:p>
+      <w:r/>
+    </w:p>
+    <w:p>
+      <w:pPr>
+        <w:pStyle w:val="Heading2"/>
+      </w:pPr>
+      <w:r>
+        <w:t>2026-10-06 dini hari WIB — Lanjutan slice 01 (perbaikan test, backend tambahan, frontend)</w:t>
+      </w:r>
+    </w:p>
+    <w:p>
+      <w:r/>
+    </w:p>
+    <w:p>
+      <w:pPr>
+        <w:pStyle w:val="Heading3"/>
+      </w:pPr>
+      <w:r>
+        <w:t>02:0x — Langkah 2: diagnosis &amp; perbaikan 2 test gagal (DIEKSEKUSI, hasil OK)</w:t>
+      </w:r>
+    </w:p>
+    <w:p>
+      <w:r/>
+    </w:p>
+    <w:p>
+      <w:pPr>
+        <w:pStyle w:val="ListBullet"/>
+      </w:pPr>
+      <w:r>
+        <w:t>`php artisan test` → 2 failed, 15 passed. Kegagalan: "suspend di tengah sesi"</w:t>
+      </w:r>
+    </w:p>
+    <w:p>
+      <w:r>
+        <w:t xml:space="preserve">  dan "logout mengakhiri sesi" — `/api/v1/sesi` masih `terautentikasi: true`.</w:t>
+      </w:r>
+    </w:p>
+    <w:p>
+      <w:pPr>
+        <w:pStyle w:val="ListBullet"/>
+      </w:pPr>
+      <w:r>
+        <w:t>Dibuat test probe sementara (tests/Feature/ProbeSesiTest.php, dihapus setelah</w:t>
+      </w:r>
+    </w:p>
+    <w:p>
+      <w:r>
+        <w:t xml:space="preserve">  diagnosis) untuk membedah state guard &amp; sesi per langkah.</w:t>
+      </w:r>
+    </w:p>
+    <w:p>
+      <w:pPr>
+        <w:pStyle w:val="ListBullet"/>
+      </w:pPr>
+      <w:r>
+        <w:t>Akar masalah (artifak proses test, bukan bug app): instance guard ter-cache</w:t>
+      </w:r>
+    </w:p>
+    <w:p>
+      <w:r>
+        <w:t xml:space="preserve">  antar request dalam satu proses PHPUnit — guard sanctum masih memegang user</w:t>
+      </w:r>
+    </w:p>
+    <w:p>
+      <w:r>
+        <w:t xml:space="preserve">  dari request login sebelumnya. Di produksi tiap HTTP request guard segar.</w:t>
+      </w:r>
+    </w:p>
+    <w:p>
+      <w:pPr>
+        <w:pStyle w:val="ListBullet"/>
+      </w:pPr>
+      <w:r>
+        <w:t>Perbaikan test (bukan melemahkan assertion): `auth()-&gt;forgetGuards()` dipanggil</w:t>
+      </w:r>
+    </w:p>
+    <w:p>
+      <w:r>
+        <w:t xml:space="preserve">  tepat sebelum setiap request yang mensimulasikan proses baru, termasuk sekali</w:t>
+      </w:r>
+    </w:p>
+    <w:p>
+      <w:r>
+        <w:t xml:space="preserve">  lagi sebelum GET /api/v1/sesi (karena request /auth/saya meng-cache ulang).</w:t>
+      </w:r>
+    </w:p>
+    <w:p>
+      <w:pPr>
+        <w:pStyle w:val="ListBullet"/>
+      </w:pPr>
+      <w:r>
+        <w:t>Middleware EnsureAccountUsable sudah aman utk request non-stateful</w:t>
+      </w:r>
+    </w:p>
+    <w:p>
+      <w:r>
+        <w:t xml:space="preserve">  (`$request-&gt;hasSession()`); 500 "Session store not set" tidak muncul lagi.</w:t>
+      </w:r>
+    </w:p>
+    <w:p>
+      <w:pPr>
+        <w:pStyle w:val="ListBullet"/>
+      </w:pPr>
+      <w:r>
+        <w:t>Hasil: `php artisan test` → 17 passed; Pint --test OK.</w:t>
+      </w:r>
+    </w:p>
+    <w:p>
+      <w:r/>
+    </w:p>
+    <w:p>
+      <w:pPr>
+        <w:pStyle w:val="Heading3"/>
+      </w:pPr>
+      <w:r>
+        <w:t>02:1x — Langkah 3: backend tambahan hasil audit alur (DIEKSEKUSI, hasil OK)</w:t>
+      </w:r>
+    </w:p>
+    <w:p>
+      <w:r/>
+    </w:p>
+    <w:p>
+      <w:pPr>
+        <w:pStyle w:val="ListBullet"/>
+      </w:pPr>
+      <w:r>
+        <w:t>Ditemukan lubang alur: akun pending (belum verifikasi) tidak bisa login, tapi</w:t>
+      </w:r>
+    </w:p>
+    <w:p>
+      <w:r>
+        <w:t xml:space="preserve">  endpoint kirim-ulang lama butuh sesi → macet. DITAMBAH endpoint publik</w:t>
+      </w:r>
+    </w:p>
+    <w:p>
+      <w:r>
+        <w:t xml:space="preserve">  POST /api/v1/auth/kirim-ulang-verifikasi-publik (throttle:auth, respons identik</w:t>
+      </w:r>
+    </w:p>
+    <w:p>
+      <w:r>
+        <w:t xml:space="preserve">  utk email tak terdaftar — anti-enumerasi; suspend/dihapus tidak dikirim).</w:t>
+      </w:r>
+    </w:p>
+    <w:p>
+      <w:pPr>
+        <w:pStyle w:val="ListBullet"/>
+      </w:pPr>
+      <w:r>
+        <w:t>PasswordResetService::terapkan() kini menyediakan callback URL reset → tautan</w:t>
+      </w:r>
+    </w:p>
+    <w:p>
+      <w:r>
+        <w:t xml:space="preserve">  email mengarah ke FRONTEND_URL + /atur-ulang-sandi?token=…&amp;email=… (SPA),</w:t>
+      </w:r>
+    </w:p>
+    <w:p>
+      <w:r>
+        <w:t xml:space="preserve">  bukan ke API.</w:t>
+      </w:r>
+    </w:p>
+    <w:p>
+      <w:pPr>
+        <w:pStyle w:val="ListBullet"/>
+      </w:pPr>
+      <w:r>
+        <w:t>Smoke test HTTP nyata (curl, cookie jar, CSRF) menemukan bug yang lolos Pest</w:t>
+      </w:r>
+    </w:p>
+    <w:p>
+      <w:r>
+        <w:t xml:space="preserve">  (karena Notification::fake mencegah pembuatan URL): notifikasi VerifyEmail</w:t>
+      </w:r>
+    </w:p>
+    <w:p>
+      <w:r>
+        <w:t xml:space="preserve">  bawaan memanggil route('verification.verify') sedangkan rute kita bernama</w:t>
+      </w:r>
+    </w:p>
+    <w:p>
+      <w:r>
+        <w:t xml:space="preserve">  auth.verifikasi-email → RouteNotFoundException 500 saat kirim email asli.</w:t>
+      </w:r>
+    </w:p>
+    <w:p>
+      <w:r>
+        <w:t xml:space="preserve">  Rute DINAMAI ulang verification.verify; test build-tautan-nyata ditambah</w:t>
+      </w:r>
+    </w:p>
+    <w:p>
+      <w:r>
+        <w:t xml:space="preserve">  (toMail() dipanggil langsung tanpa fake) sebagai regresi.</w:t>
+      </w:r>
+    </w:p>
+    <w:p>
+      <w:pPr>
+        <w:pStyle w:val="ListBullet"/>
+      </w:pPr>
+      <w:r>
+        <w:t>Alur end-to-end via curl terverifikasi: csrf-cookie 204 → daftar 201 → masuk</w:t>
+      </w:r>
+    </w:p>
+    <w:p>
+      <w:r>
+        <w:t xml:space="preserve">  pending 422 (pesan identik dgn kredensial salah) → kirim-ulang 200 → klik</w:t>
+      </w:r>
+    </w:p>
+    <w:p>
+      <w:r>
+        <w:t xml:space="preserve">  tautan 302 ke frontend /verifikasi-email?status=berhasil → masuk 200 (aktif)</w:t>
+      </w:r>
+    </w:p>
+    <w:p>
+      <w:r>
+        <w:t xml:space="preserve">  → GET /auth/saya 200 (role murid, tanpa password).</w:t>
+      </w:r>
+    </w:p>
+    <w:p>
+      <w:pPr>
+        <w:pStyle w:val="ListBullet"/>
+      </w:pPr>
+      <w:r>
+        <w:t>`php artisan test` → 21 passed (73 assertions); Pint --test OK.</w:t>
+      </w:r>
+    </w:p>
+    <w:p>
+      <w:r/>
+    </w:p>
+    <w:p>
+      <w:pPr>
+        <w:pStyle w:val="Heading3"/>
+      </w:pPr>
+      <w:r>
+        <w:t>02:2x — Langkah 4: frontend auth lengkap (DIEKSEKUSI, hasil OK)</w:t>
+      </w:r>
+    </w:p>
+    <w:p>
+      <w:r/>
+    </w:p>
+    <w:p>
+      <w:pPr>
+        <w:pStyle w:val="ListBullet"/>
+      </w:pPr>
+      <w:r>
+        <w:t>src/sections/auth/api.js: semua endpoint slice 01; SKEMA ZOD utk setiap</w:t>
+      </w:r>
+    </w:p>
+    <w:p>
+      <w:r>
+        <w:t xml:space="preserve">  respons (skemaUser, skemaPesan, skemaSesi); pesanGalatApi() aman; teksGalat()</w:t>
+      </w:r>
+    </w:p>
+    <w:p>
+      <w:r>
+        <w:t xml:space="preserve">  utk render galat RHF; ambilCsrfCookie() sebelum tiap mutasi; TANPA token di</w:t>
+      </w:r>
+    </w:p>
+    <w:p>
+      <w:r>
+        <w:t xml:space="preserve">  localStorage.</w:t>
+      </w:r>
+    </w:p>
+    <w:p>
+      <w:pPr>
+        <w:pStyle w:val="ListBullet"/>
+      </w:pPr>
+      <w:r>
+        <w:t>src/sections/auth/validasi.js: skema Zod form (nama 2-60, email, sandi</w:t>
+      </w:r>
+    </w:p>
+    <w:p>
+      <w:r>
+        <w:t xml:space="preserve">  min 10, konfirmasi, token wajib utk reset).</w:t>
+      </w:r>
+    </w:p>
+    <w:p>
+      <w:pPr>
+        <w:pStyle w:val="ListBullet"/>
+      </w:pPr>
+      <w:r>
+        <w:t>src/sections/auth/authStore.js (zustand): user + detikTunggu; aksi</w:t>
+      </w:r>
+    </w:p>
+    <w:p>
+      <w:r>
+        <w:t xml:space="preserve">  masuk/keluar/muatUser/mulaiTungguThrottle; pasangListenerSesi() mendengarkan</w:t>
+      </w:r>
+    </w:p>
+    <w:p>
+      <w:r>
+        <w:t xml:space="preserve">  event `auth:sesi-habis` (401/419 → kosongkan user) &amp; `auth:throttle`</w:t>
+      </w:r>
+    </w:p>
+    <w:p>
+      <w:r>
+        <w:t xml:space="preserve">  (429 → hitung mundur dari Retry-After).</w:t>
+      </w:r>
+    </w:p>
+    <w:p>
+      <w:pPr>
+        <w:pStyle w:val="ListBullet"/>
+      </w:pPr>
+      <w:r>
+        <w:t>6 halaman: HalamanMasuk, HalamanDaftar, HalamanLupaSandi,</w:t>
+      </w:r>
+    </w:p>
+    <w:p>
+      <w:r>
+        <w:t xml:space="preserve">  HalamanAturUlangSandi (token+email dari query), HalamanVerifikasiEmail</w:t>
+      </w:r>
+    </w:p>
+    <w:p>
+      <w:r>
+        <w:t xml:space="preserve">  (query status=berhasil|gagal divalidasi Zod), HalamanPerluVerifikasi.</w:t>
+      </w:r>
+    </w:p>
+    <w:p>
+      <w:pPr>
+        <w:pStyle w:val="ListBullet"/>
+      </w:pPr>
+      <w:r>
+        <w:t>App.jsx dirombak total: demo slice 00 dilepas, jadi router (7 rute) + header</w:t>
+      </w:r>
+    </w:p>
+    <w:p>
+      <w:r>
+        <w:t xml:space="preserve">  + beranda tamu/masuk + tombol tema.</w:t>
+      </w:r>
+    </w:p>
+    <w:p>
+      <w:pPr>
+        <w:pStyle w:val="ListBullet"/>
+      </w:pPr>
+      <w:r>
+        <w:t>Perbaikan client.js: ambilCsrfCookie() kini pakai barel axios terpisah</w:t>
+      </w:r>
+    </w:p>
+    <w:p>
+      <w:r>
+        <w:t xml:space="preserve">  (baseURL '/') — sebelumnya URL jadi /api/sanctum/csrf-cookie (404) sehingga</w:t>
+      </w:r>
+    </w:p>
+    <w:p>
+      <w:r>
+        <w:t xml:space="preserve">  cookie CSRF tak terbentuk dan semua mutasi kena 419; resetStatusSiaran()</w:t>
+      </w:r>
+    </w:p>
+    <w:p>
+      <w:r>
+        <w:t xml:space="preserve">  ditambah; 429 kini sekali per gelombang (anti spam event).</w:t>
+      </w:r>
+    </w:p>
+    <w:p>
+      <w:pPr>
+        <w:pStyle w:val="ListBullet"/>
+      </w:pPr>
+      <w:r>
+        <w:t>Vitest 23 test (6 berkas): skema Zod, countdown throttle, alur 401/419/429</w:t>
+      </w:r>
+    </w:p>
+    <w:p>
+      <w:r>
+        <w:t xml:space="preserve">  lewat AxiosError asli (adapter stub), environment jsdom per berkas.</w:t>
+      </w:r>
+    </w:p>
+    <w:p>
+      <w:pPr>
+        <w:pStyle w:val="ListBullet"/>
+      </w:pPr>
+      <w:r>
+        <w:t>npm run check (tsc checkJs) OK; eslint OK.</w:t>
+      </w:r>
+    </w:p>
+    <w:p>
+      <w:r/>
+    </w:p>
+    <w:p>
+      <w:pPr>
+        <w:pStyle w:val="Heading3"/>
+      </w:pPr>
+      <w:r>
+        <w:t>02:3x — Langkah 5: verify.sh hijau + commit (DIEKSEKUSI, hasil OK)</w:t>
+      </w:r>
+    </w:p>
+    <w:p>
+      <w:r/>
+    </w:p>
+    <w:p>
+      <w:pPr>
+        <w:pStyle w:val="ListBullet"/>
+      </w:pPr>
+      <w:r>
+        <w:t>./verify.sh → SEMUA HIJAU 6/6: Backend Pest (21), Pint, checkJs, ESLint,</w:t>
+      </w:r>
+    </w:p>
+    <w:p>
+      <w:r>
+        <w:t xml:space="preserve">  Vitest (23), realtime node --test.</w:t>
+      </w:r>
+    </w:p>
+    <w:p>
+      <w:pPr>
+        <w:pStyle w:val="ListBullet"/>
+      </w:pPr>
+      <w:r>
+        <w:t>Commit kecil bertahap: ad68536 (backend auth) &amp; f4793a3 (frontend auth).</w:t>
+      </w:r>
+    </w:p>
+    <w:p>
+      <w:pPr>
+        <w:pStyle w:val="ListBullet"/>
+      </w:pPr>
+      <w:r>
+        <w:t>Dev server Laravel di-restart (php artisan serve :8000) krn sesi terminal</w:t>
+      </w:r>
+    </w:p>
+    <w:p>
+      <w:r>
+        <w:t xml:space="preserve">  lama mati; Vite :5173 tetap jalan.</w:t>
+      </w:r>
+    </w:p>
+    <w:p>
+      <w:r/>
+    </w:p>
+    <w:p>
+      <w:r>
+        <w:t>────────────────────────────────────────</w:t>
+      </w:r>
+    </w:p>
+    <w:p>
+      <w:r/>
+    </w:p>
+    <w:p>
+      <w:pPr>
+        <w:pStyle w:val="Heading2"/>
+      </w:pPr>
+      <w:r>
+        <w:t>2026-10-06 — Tambahan atas permintaan pengguna: arsip transkrip MENTAH</w:t>
+      </w:r>
+    </w:p>
+    <w:p>
+      <w:r/>
+    </w:p>
+    <w:p>
+      <w:r>
+        <w:t>Pengguna: "tambahan section log benar benar benar mentah bukan ringkasan saat</w:t>
+      </w:r>
+    </w:p>
+    <w:p>
+      <w:r>
+        <w:t>thinking output dll" → diminta arsip yang benar-benar mentah (transkrip pesan</w:t>
+      </w:r>
+    </w:p>
+    <w:p>
+      <w:r>
+        <w:t>pengguna + narasi asisten + keluaran kunci verbatim, bukan ringkasan kerja).</w:t>
+      </w:r>
+    </w:p>
+    <w:p>
+      <w:r/>
+    </w:p>
+    <w:p>
+      <w:pPr>
+        <w:pStyle w:val="ListBullet"/>
+      </w:pPr>
+      <w:r>
+        <w:t>DIBUAT: docs/log-mentah/arsip-prompt/2026-10-06-prompt-2-lanjutan-mentah.md</w:t>
+      </w:r>
+    </w:p>
+    <w:p>
+      <w:r>
+        <w:t xml:space="preserve">  (361 baris) — salinan verbatim per prompt (2a "lanjutkan", 2b "lanjutkan",</w:t>
+      </w:r>
+    </w:p>
+    <w:p>
+      <w:r>
+        <w:t xml:space="preserve">  2c "lanjutkanlanjut", 2d "sudha di commmit dan di logging?"): teks pesan</w:t>
+      </w:r>
+    </w:p>
+    <w:p>
+      <w:r>
+        <w:t xml:space="preserve">  pengguna apa adanya (termasuk typo), seluruh kalimat narasi asisten</w:t>
+      </w:r>
+    </w:p>
+    <w:p>
+      <w:r>
+        <w:t xml:space="preserve">  berurutan, dan kutipan keluaran kunci persis seperti tertampil (probe guard</w:t>
+      </w:r>
+    </w:p>
+    <w:p>
+      <w:r>
+        <w:t xml:space="preserve">  dump, hitungan test 17→21→verify.sh 6/6, alur smoke 1.csrf s.d. 8.auth-saya,</w:t>
+      </w:r>
+    </w:p>
+    <w:p>
+      <w:r>
+        <w:t xml:space="preserve">  potongan git commit/push).</w:t>
+      </w:r>
+    </w:p>
+    <w:p>
+      <w:pPr>
+        <w:pStyle w:val="ListBullet"/>
+      </w:pPr>
+      <w:r>
+        <w:t>CATATAN JUJUR di kepala arsip: jejak thinking internal tidak ikut tersimpan</w:t>
+      </w:r>
+    </w:p>
+    <w:p>
+      <w:r>
+        <w:t xml:space="preserve">  dalam catatan sesi sehingga TIDAK direkonstruksi/dibuat-buat; yang diarsip</w:t>
+      </w:r>
+    </w:p>
+    <w:p>
+      <w:r>
+        <w:t xml:space="preserve">  hanya yang benar-benar ada pada transkrip.</w:t>
+      </w:r>
+    </w:p>
+    <w:p>
+      <w:pPr>
+        <w:pStyle w:val="ListBullet"/>
+      </w:pPr>
+      <w:r>
+        <w:t>Entri ringkasan "Langkah 2–5" di atas tetap dipertahankan (append-only,</w:t>
+      </w:r>
+    </w:p>
+    <w:p>
+      <w:r>
+        <w:t xml:space="preserve">  tidak disunting); arsip mentah ini adalah pelengkapnya, bukan pengganti.</w:t>
+      </w:r>
+    </w:p>
     <w:sectPr>
       <w:pgSz w:w="12240" w:h="15840"/>
       <w:pgMar w:top="1440" w:right="1800" w:bottom="1440" w:left="1800" w:header="720" w:footer="720" w:gutter="0"/>

</xml_diff>

<commit_message>
Dokumentasi: Word bonus untuk prompt, ringkasan prompt, dan log mentah utuh
Dokumen internal tetap .md; Word di docs/word/ kini memuat prompt mentah
(AGENT.docx), ringkasan prompt (ringkasan-prompt.docx), dan log mentah UTUH
dari berkas sesi asli (log-mentah.docx, tanpa potong/ringkas). Log mentah
diperbarui setiap commit.

🤖 Generated with Codebuff
Co-Authored-By: Codebuff <noreply@codebuff.com>
</commit_message>
<xml_diff>
--- a/docs/word-arsip/(ARSIP) laporan-kerja-prompt-2.docx
+++ b/docs/word-arsip/(ARSIP) laporan-kerja-prompt-2.docx
@@ -1580,6 +1580,161 @@
     <w:p>
       <w:r>
         <w:t xml:space="preserve">  murid melihat retry=false, murid ubah = 403, tamu ekspor = 401 JSON.</w:t>
+      </w:r>
+    </w:p>
+    <w:p>
+      <w:r/>
+    </w:p>
+    <w:p>
+      <w:r>
+        <w:t>────────────────────────────────────────</w:t>
+      </w:r>
+    </w:p>
+    <w:p>
+      <w:r/>
+    </w:p>
+    <w:p>
+      <w:pPr>
+        <w:pStyle w:val="Heading2"/>
+      </w:pPr>
+      <w:r>
+        <w:t>2026-10-06 05:29:23 WIB — Revisi dokumentasi: Word bonus (prompt, ringkasan prompt, log mentah utuh)</w:t>
+      </w:r>
+    </w:p>
+    <w:p>
+      <w:r/>
+    </w:p>
+    <w:p>
+      <w:r>
+        <w:t>Prompt pengguna (verbatim, dengan typo): "revisi untuk dokumentasi ingat di docs</w:t>
+      </w:r>
+    </w:p>
+    <w:p>
+      <w:r>
+        <w:t>agents dll pake md dan yang bener ebenr ringkasan rpmot dna prmot itu di buat</w:t>
+      </w:r>
+    </w:p>
+    <w:p>
+      <w:r>
+        <w:t>dalam word bukan md selain itu log nya kau ambil di namun kau gka pelro</w:t>
+      </w:r>
+    </w:p>
+    <w:p>
+      <w:r>
+        <w:t>potong/ringkas dll bairkna log nya semua nay dalam word".</w:t>
+      </w:r>
+    </w:p>
+    <w:p>
+      <w:r>
+        <w:t>Klarifikasi pengguna: sumber log = SEMUA berkas sesi (chat-messages.json,</w:t>
+      </w:r>
+    </w:p>
+    <w:p>
+      <w:r>
+        <w:t>log.jsonl, run-state.json, chat-meta.json); Word = dokumentasi BONUS; log wajib</w:t>
+      </w:r>
+    </w:p>
+    <w:p>
+      <w:r>
+        <w:t>diperbarui setiap commit.</w:t>
+      </w:r>
+    </w:p>
+    <w:p>
+      <w:r/>
+    </w:p>
+    <w:p>
+      <w:pPr>
+        <w:pStyle w:val="ListBullet"/>
+      </w:pPr>
+      <w:r>
+        <w:t>KEBIJAKAN: dokumen internal tetap .md (AGENT.md, chunks, docs/*.md); Word</w:t>
+      </w:r>
+    </w:p>
+    <w:p>
+      <w:r>
+        <w:t xml:space="preserve">  (docs/word/) adalah bonus untuk dibaca manusia.</w:t>
+      </w:r>
+    </w:p>
+    <w:p>
+      <w:pPr>
+        <w:pStyle w:val="ListBullet"/>
+      </w:pPr>
+      <w:r>
+        <w:t>DIBUAT: docs/export_word_sesi.py — penulis DOCX ringan (XML+zip) yang memuat</w:t>
+      </w:r>
+    </w:p>
+    <w:p>
+      <w:r>
+        <w:t xml:space="preserve">  log mentah UTUH: lampiran prompt, thinking, narasi, tool (input+output),</w:t>
+      </w:r>
+    </w:p>
+    <w:p>
+      <w:r>
+        <w:t xml:space="preserve">  ask-user, mode-divider, userError, metadata; lalu chat-meta.json, log.jsonl</w:t>
+      </w:r>
+    </w:p>
+    <w:p>
+      <w:r>
+        <w:t xml:space="preserve">  (semua baris), dan run-state.json, ditambah log kerja docs/log-mentah/*.md.</w:t>
+      </w:r>
+    </w:p>
+    <w:p>
+      <w:r>
+        <w:t xml:space="preserve">  Menggabungkan baris via &lt;w:br/&gt; agar jumlah paragraf wajar (≈7.000), bukan</w:t>
+      </w:r>
+    </w:p>
+    <w:p>
+      <w:r>
+        <w:t xml:space="preserve">  ratusan ribu — isi tetap apa adanya tanpa potong/ringkas.</w:t>
+      </w:r>
+    </w:p>
+    <w:p>
+      <w:pPr>
+        <w:pStyle w:val="ListBullet"/>
+      </w:pPr>
+      <w:r>
+        <w:t>DIUBAH: docs/export-word.sh — docs/word/ kini = AGENT.docx (prompt v1+v2),</w:t>
+      </w:r>
+    </w:p>
+    <w:p>
+      <w:r>
+        <w:t xml:space="preserve">  ringkasan-prompt.docx (jurnal), log-mentah.docx (log utuh dari berkas sesi);</w:t>
+      </w:r>
+    </w:p>
+    <w:p>
+      <w:r>
+        <w:t xml:space="preserve">  word-arsip tetap arsip. SESI_DIR dapat diatur lewat env.</w:t>
+      </w:r>
+    </w:p>
+    <w:p>
+      <w:pPr>
+        <w:pStyle w:val="ListBullet"/>
+      </w:pPr>
+      <w:r>
+        <w:t>DIUBAH: 00-index.json + AGENT.md — dicatat kebijakan md vs Word bonus dan</w:t>
+      </w:r>
+    </w:p>
+    <w:p>
+      <w:r>
+        <w:t xml:space="preserve">  kewajiban memperbarui log setiap commit.</w:t>
+      </w:r>
+    </w:p>
+    <w:p>
+      <w:pPr>
+        <w:pStyle w:val="ListBullet"/>
+      </w:pPr>
+      <w:r>
+        <w:t>BUKTI: docs/word/log-mentah.docx ≈ 6,6 MB, 54 pesan, 1.624 baris log.jsonl,</w:t>
+      </w:r>
+    </w:p>
+    <w:p>
+      <w:r>
+        <w:t xml:space="preserve">  terverifikasi via python-docx memuat "THINKING ASLI", "PESAN 54",</w:t>
+      </w:r>
+    </w:p>
+    <w:p>
+      <w:r>
+        <w:t xml:space="preserve">  "run-state.json", dan prompt pertama "baut folde ritu".</w:t>
       </w:r>
     </w:p>
     <w:sectPr>

</xml_diff>

<commit_message>
Dokumentasi: Word dipecah per peran dan mapel tanpa guru pengampu
docs/word/ kini khusus dokumentasi untuk AI (AGENT.docx + AGENT.md dengan isi
identik), sedangkan ringkasan-prompt.docx dan log-mentah.docx (log utuh apa
adanya) pindah ke docs/log-mentah/ sesuai catatan pengguna; export-word.sh
menyesuaikan tata letak ini. Revisi pengguna bahwa mapel cukup jadi data induk
sekolah tanpa daftar guru pengampu dicatat sebagai constraint slice 02 supaya
slice lanjutan tidak menambahkannya, dan log mentah diperbarui (verify.sh hijau,
smoke CDP kelima halaman guru).

🤖 Generated with Codebuff
Co-Authored-By: Codebuff <noreply@codebuff.com>
</commit_message>
<xml_diff>
--- a/docs/word-arsip/(ARSIP) laporan-kerja-prompt-2.docx
+++ b/docs/word-arsip/(ARSIP) laporan-kerja-prompt-2.docx
@@ -1735,6 +1735,340 @@
     <w:p>
       <w:r>
         <w:t xml:space="preserve">  "run-state.json", dan prompt pertama "baut folde ritu".</w:t>
+      </w:r>
+    </w:p>
+    <w:p>
+      <w:r/>
+    </w:p>
+    <w:p>
+      <w:r>
+        <w:t>────────────────────────────────────────</w:t>
+      </w:r>
+    </w:p>
+    <w:p>
+      <w:r/>
+    </w:p>
+    <w:p>
+      <w:pPr>
+        <w:pStyle w:val="Heading2"/>
+      </w:pPr>
+      <w:r>
+        <w:t>2026-10-06 06:42 WIB — Patch UI baru diterapkan, smoke CDP, tata ulang dokumen Word, revisi mapel</w:t>
+      </w:r>
+    </w:p>
+    <w:p>
+      <w:r/>
+    </w:p>
+    <w:p>
+      <w:r>
+        <w:t>Prompt pengguna (verbatim, typo dibiarkan): "lanjutkan dan ku sudha berikan info</w:t>
+      </w:r>
+    </w:p>
+    <w:p>
+      <w:r>
+        <w:t>elbih alnjut di docs di agent.txt lanjutkan". Saat pekerjaan berjalan pengguna</w:t>
+      </w:r>
+    </w:p>
+    <w:p>
+      <w:r>
+        <w:t>menambahkan revisi (verbatim): "revisi asingkron gak pelru ada list mapel yang</w:t>
+      </w:r>
+    </w:p>
+    <w:p>
+      <w:r>
+        <w:t>ngatur guru nya sendiri".</w:t>
+      </w:r>
+    </w:p>
+    <w:p>
+      <w:r/>
+    </w:p>
+    <w:p>
+      <w:r>
+        <w:t>CATATAN: berkas yang dimaksud pengguna ternyata BUKAN docs/agent.txt (tidak ada),</w:t>
+      </w:r>
+    </w:p>
+    <w:p>
+      <w:r>
+        <w:t>melainkan dua catatan di docs/log-mentah/agent.txt ("taruh dokumentasi Word di</w:t>
+      </w:r>
+    </w:p>
+    <w:p>
+      <w:r>
+        <w:t>sini: rangkuman prompt dan log lengkap semua char di freebuff") dan</w:t>
+      </w:r>
+    </w:p>
+    <w:p>
+      <w:r>
+        <w:t>docs/word/agent.txt ("jadikan folder ini dokumen untuk AI, jadiin docx-nya jadi md</w:t>
+      </w:r>
+    </w:p>
+    <w:p>
+      <w:r>
+        <w:t>juga; log mentah dan ringkasan pindahin ke log-mentah"). Keduanya dipindahkan ke</w:t>
+      </w:r>
+    </w:p>
+    <w:p>
+      <w:r>
+        <w:t>docs/log-mentah/arsip-prompt/catatan-agent-2026-10-06-*.txt sebagai bukti proses.</w:t>
+      </w:r>
+    </w:p>
+    <w:p>
+      <w:r/>
+    </w:p>
+    <w:p>
+      <w:pPr>
+        <w:pStyle w:val="ListBullet"/>
+      </w:pPr>
+      <w:r>
+        <w:t>PATCH UI BARU DITERAPKAN (git apply -p1 ui-baru-upgrade-timeout.patch; lalu</w:t>
+      </w:r>
+    </w:p>
+    <w:p>
+      <w:r>
+        <w:t xml:space="preserve">  --exclude='*App.jsx' untuk ui-baru.patch; App.jsx + KerangkaUmum.jsx ditulis</w:t>
+      </w:r>
+    </w:p>
+    <w:p>
+      <w:r>
+        <w:t xml:space="preserve">  ulang manual agar rute slice 02 tetap hidup di router baru):</w:t>
+      </w:r>
+    </w:p>
+    <w:p>
+      <w:pPr>
+        <w:pStyle w:val="ListBullet"/>
+      </w:pPr>
+      <w:r>
+        <w:t>BARU: shared/layout/{KerangkaAuth,KerangkaUmum,Merek,TombolTema}.jsx,</w:t>
+      </w:r>
+    </w:p>
+    <w:p>
+      <w:r>
+        <w:rPr>
+          <w:rFonts w:ascii="Courier New" w:hAnsi="Courier New"/>
+          <w:sz w:val="18"/>
+        </w:rPr>
+        <w:t xml:space="preserve">    shared/store/tema.js, shared/ui/{Banner,Isian,Langkah,Maskot,MeterSandi,</w:t>
+      </w:r>
+    </w:p>
+    <w:p>
+      <w:r>
+        <w:rPr>
+          <w:rFonts w:ascii="Courier New" w:hAnsi="Courier New"/>
+          <w:sz w:val="18"/>
+        </w:rPr>
+        <w:t xml:space="preserve">    Tombol}.jsx, shared/ui/{kekuatanSandi,useHitungMundur}.js,</w:t>
+      </w:r>
+    </w:p>
+    <w:p>
+      <w:r>
+        <w:rPr>
+          <w:rFonts w:ascii="Courier New" w:hAnsi="Courier New"/>
+          <w:sz w:val="18"/>
+        </w:rPr>
+        <w:t xml:space="preserve">    sections/home/{Beranda,HalamanTidakDitemukan}.jsx,</w:t>
+      </w:r>
+    </w:p>
+    <w:p>
+      <w:r>
+        <w:rPr>
+          <w:rFonts w:ascii="Courier New" w:hAnsi="Courier New"/>
+          <w:sz w:val="18"/>
+        </w:rPr>
+        <w:t xml:space="preserve">    sections/auth/{KartuAuth,KirimUlangVerifikasi,PeringatanTunggu}.jsx.</w:t>
+      </w:r>
+    </w:p>
+    <w:p>
+      <w:pPr>
+        <w:pStyle w:val="ListBullet"/>
+      </w:pPr>
+      <w:r>
+        <w:t>DIUBAH: App.jsx (KerangkaAuth/KerangkaUmum/HanyaTamu/HanyaGuru, LayarMemuat,</w:t>
+      </w:r>
+    </w:p>
+    <w:p>
+      <w:r>
+        <w:rPr>
+          <w:rFonts w:ascii="Courier New" w:hAnsi="Courier New"/>
+          <w:sz w:val="18"/>
+        </w:rPr>
+        <w:t xml:space="preserve">    listener auth:sesi-habis), icons.jsx, main.jsx, 6 halaman auth, authStore.js</w:t>
+      </w:r>
+    </w:p>
+    <w:p>
+      <w:r>
+        <w:rPr>
+          <w:rFonts w:ascii="Courier New" w:hAnsi="Courier New"/>
+          <w:sz w:val="18"/>
+        </w:rPr>
+        <w:t xml:space="preserve">    (+sesiSiap, pulihkanSesi, sudahDitampilkanSebagaiTunggu), toast.jsx,</w:t>
+      </w:r>
+    </w:p>
+    <w:p>
+      <w:r>
+        <w:rPr>
+          <w:rFonts w:ascii="Courier New" w:hAnsi="Courier New"/>
+          <w:sz w:val="18"/>
+        </w:rPr>
+        <w:t xml:space="preserve">    theme.css, client.js (timeout 15.000 ms), KerangkaUmum.jsx (nav menu-data</w:t>
+      </w:r>
+    </w:p>
+    <w:p>
+      <w:r>
+        <w:rPr>
+          <w:rFonts w:ascii="Courier New" w:hAnsi="Courier New"/>
+          <w:sz w:val="18"/>
+        </w:rPr>
+        <w:t xml:space="preserve">    Kelas/Mapel/Murid/Pengaturan hanya guru/admin).</w:t>
+      </w:r>
+    </w:p>
+    <w:p>
+      <w:pPr>
+        <w:pStyle w:val="ListBullet"/>
+      </w:pPr>
+      <w:r>
+        <w:t>PERBAIKAN PAGAR MUTU yang muncul dari patch (semua ditemukan &amp; dibereskan,</w:t>
+      </w:r>
+    </w:p>
+    <w:p>
+      <w:r>
+        <w:t xml:space="preserve">  bukan di-skip): tema.test.js ditulis ulang pakai import.meta.glob (hindari</w:t>
+      </w:r>
+    </w:p>
+    <w:p>
+      <w:r>
+        <w:t xml:space="preserve">  node:fs/__dirname di environment ber-checkJs); useHitungMundur.test.jsx</w:t>
+      </w:r>
+    </w:p>
+    <w:p>
+      <w:r>
+        <w:t xml:space="preserve">  di-rewrite (nilai hook ditangkap lewat useEffect + ambilApi() agar ESLint</w:t>
+      </w:r>
+    </w:p>
+    <w:p>
+      <w:r>
+        <w:t xml:space="preserve">  react-hooks/globals tidak error); tema.test.js diberi</w:t>
+      </w:r>
+    </w:p>
+    <w:p>
+      <w:r>
+        <w:t xml:space="preserve">  "// @vitest-environment jsdom" (environment default repo = node).</w:t>
+      </w:r>
+    </w:p>
+    <w:p>
+      <w:pPr>
+        <w:pStyle w:val="ListBullet"/>
+      </w:pPr>
+      <w:r>
+        <w:t>BUKTI: verify.sh SEMUA HIJAU (6/6; Pest + Pint + checkJs + ESLint + Vitest 16</w:t>
+      </w:r>
+    </w:p>
+    <w:p>
+      <w:r>
+        <w:t xml:space="preserve">  berkas/71 test + realtime 2); npm run build sukses (267 modul,</w:t>
+      </w:r>
+    </w:p>
+    <w:p>
+      <w:r>
+        <w:t xml:space="preserve">  index-CaQWaurO.js 533,95 kB); sisa 2 warning react-hooks/incompatible-library</w:t>
+      </w:r>
+    </w:p>
+    <w:p>
+      <w:r>
+        <w:t xml:space="preserve">  dari watch() RHF (warning, bukan error).</w:t>
+      </w:r>
+    </w:p>
+    <w:p>
+      <w:pPr>
+        <w:pStyle w:val="ListBullet"/>
+      </w:pPr>
+      <w:r>
+        <w:t>SMOKE CDP (Chrome headless --headless=old, port 9333, docs/smoke-ui-cdp.mjs):</w:t>
+      </w:r>
+    </w:p>
+    <w:p>
+      <w:r>
+        <w:t xml:space="preserve">  login admin lewat fetch sesi Sanctum -&gt; status 200 role admin; lalu:</w:t>
+      </w:r>
+    </w:p>
+    <w:p>
+      <w:r>
+        <w:t xml:space="preserve">  /kelas "Kelola Kelas" (5A/6A/6B dari seeder), /mapel "Kelola Mata Pelajaran"</w:t>
+      </w:r>
+    </w:p>
+    <w:p>
+      <w:r>
+        <w:t xml:space="preserve">  (BIN/IPA/MTK), /murid "Data Murid" (Ayu/Budi/Citra, tombol Impor &amp; Ekspor CSV),</w:t>
+      </w:r>
+    </w:p>
+    <w:p>
+      <w:r>
+        <w:t xml:space="preserve">  /murid/impor "Impor Murid dari CSV", /pengaturan "Pengaturan Tiga Lapis";</w:t>
+      </w:r>
+    </w:p>
+    <w:p>
+      <w:r>
+        <w:t xml:space="preserve">  nav menampilkan Kelas|Mapel|Murid|Pengaturan =&gt; menu guru aktif. Judul tab</w:t>
+      </w:r>
+    </w:p>
+    <w:p>
+      <w:r>
+        <w:t xml:space="preserve">  "Ulangan Sekolah".</w:t>
+      </w:r>
+    </w:p>
+    <w:p>
+      <w:pPr>
+        <w:pStyle w:val="ListBullet"/>
+      </w:pPr>
+      <w:r>
+        <w:t>TATA ULANG DOKUMEN WORD (permintaan pengguna): docs/word/ = dokumentasi untuk</w:t>
+      </w:r>
+    </w:p>
+    <w:p>
+      <w:r>
+        <w:t xml:space="preserve">  AI dalam .docx DAN .md -&gt; docs/word/AGENT.docx + docs/word/AGENT.md (isi</w:t>
+      </w:r>
+    </w:p>
+    <w:p>
+      <w:r>
+        <w:t xml:space="preserve">  identik: prompt v1+v2); docs/log-mentah/ = ringkasan-prompt.docx + log-mentah.docx</w:t>
+      </w:r>
+    </w:p>
+    <w:p>
+      <w:r>
+        <w:t xml:space="preserve">  (Word, isi apa adanya). export-word.sh diperbarui mengikuti tata letak ini.</w:t>
+      </w:r>
+    </w:p>
+    <w:p>
+      <w:r>
+        <w:t xml:space="preserve">  log-mentah.docx sekarang 7,07 MB (60 pesan, 1.815 baris log.jsonl).</w:t>
+      </w:r>
+    </w:p>
+    <w:p>
+      <w:pPr>
+        <w:pStyle w:val="ListBullet"/>
+      </w:pPr>
+      <w:r>
+        <w:t>REVISI MAPEL: mapel = data induk tingkat sekolah; tidak ada daftar guru</w:t>
+      </w:r>
+    </w:p>
+    <w:p>
+      <w:r>
+        <w:t xml:space="preserve">  pengampu per mapel. Kode slice 02 memang sudah seperti itu (Mapel tanpa kolom</w:t>
+      </w:r>
+    </w:p>
+    <w:p>
+      <w:r>
+        <w:t xml:space="preserve">  guru, form mapel hanya nama+kode), jadi tidak ada perubahan kode — aturannya</w:t>
+      </w:r>
+    </w:p>
+    <w:p>
+      <w:r>
+        <w:t xml:space="preserve">  dicatat sebagai constraint di chunks/slice-02.json agar slice lanjutan tidak</w:t>
+      </w:r>
+    </w:p>
+    <w:p>
+      <w:r>
+        <w:t xml:space="preserve">  menambahkannya.</w:t>
       </w:r>
     </w:p>
     <w:sectPr>

</xml_diff>

<commit_message>
Dokumentasi: berkas penanda pengguna masuk ke dokumentasi utama + aturan lokasi test
Berkas penanda di docs/log-mentah (log dan prompt pekerjaan UI/UX yang dikerjakan
AI lain di luar repo) belum pernah masuk dokumentasi yang dikumpulkan. Isinya kini
ada apa adanya sebagai dua berkas .md sehingga otomatis ikut ke log-mentah.docx
(dokumen log mentah utama), promptnya juga dilampirkan sebagai prompt ketiga di
AGENT.docx/AGENT.md lewat PROMPT_V3 pada export-word.sh, dan diarsipkan di
word-arsip. Keterbukaan prosesnya ditulis eksplisit: pekerjaan itu dibuat di luar
repo, dan tidak ada klaim di dalamnya yang dianggap bukti sebelum diverifikasi di
repo ini. Sekalian dicatat di AGENT.md bahwa berkas uji terpusat di
src/__tests__/ (frontend), backend/tests/, dan realtime/test/, plus laporan A.8
untuk kedua perubahan.

🤖 Generated with Codebuff
Co-Authored-By: Codebuff <noreply@codebuff.com>
</commit_message>
<xml_diff>
--- a/docs/word-arsip/(ARSIP) laporan-kerja-prompt-2.docx
+++ b/docs/word-arsip/(ARSIP) laporan-kerja-prompt-2.docx
@@ -3800,6 +3800,210 @@
       </w:pPr>
       <w:r>
         <w:t>Mode tim (slice 09) belum dipertimbangkan di ranking; ranking saat ini per murid.</w:t>
+      </w:r>
+    </w:p>
+    <w:p>
+      <w:r/>
+    </w:p>
+    <w:p>
+      <w:pPr>
+        <w:pStyle w:val="Heading2"/>
+      </w:pPr>
+      <w:r>
+        <w:t>2026-10-06 — Rapikan lokasi berkas uji + dokumentasi penanda dimasukkan ke dokumentasi utama</w:t>
+      </w:r>
+    </w:p>
+    <w:p>
+      <w:r/>
+    </w:p>
+    <w:p>
+      <w:r>
+        <w:t>Permintaan pengguna: (1) rapikan lokasi berkas test jangan tersebar di setiap folder;</w:t>
+      </w:r>
+    </w:p>
+    <w:p>
+      <w:r>
+        <w:t>(2) baca dokumen penanda yang ditulis di `docs` lalu tambahkan ke dokumentasi utama;</w:t>
+      </w:r>
+    </w:p>
+    <w:p>
+      <w:r>
+        <w:t>(3) selesaikan fitur yang belum dalam bentuk MVP.</w:t>
+      </w:r>
+    </w:p>
+    <w:p>
+      <w:r/>
+    </w:p>
+    <w:p>
+      <w:pPr>
+        <w:pStyle w:val="Heading3"/>
+      </w:pPr>
+      <w:r>
+        <w:t>1) Dokumentasi penanda → dokumentasi utama</w:t>
+      </w:r>
+    </w:p>
+    <w:p>
+      <w:r/>
+    </w:p>
+    <w:p>
+      <w:r>
+        <w:t>Dua berkas penanda di `docs/log-mentah/` (`log_claude(tambahkan ke main dokumentasion.txt`,</w:t>
+      </w:r>
+    </w:p>
+    <w:p>
+      <w:r>
+        <w:t>`promt_claude.txt`) berisi log + prompt pekerjaan AI lain yang merombak UI/UX slice 00–02 **di luar</w:t>
+      </w:r>
+    </w:p>
+    <w:p>
+      <w:r>
+        <w:t>repo** (memakai salinan zip). Sesuai aturan jurnal (`AGENT.md`: hasil yang dibuat di luar repo</w:t>
+      </w:r>
+    </w:p>
+    <w:p>
+      <w:r>
+        <w:t>wajib dicatat), isinya dimasukkan apa adanya:</w:t>
+      </w:r>
+    </w:p>
+    <w:p>
+      <w:r/>
+    </w:p>
+    <w:p>
+      <w:pPr>
+        <w:pStyle w:val="ListBullet"/>
+      </w:pPr>
+      <w:r>
+        <w:t>`docs/log-mentah/2026-10-06-log-claude-ui-baru.md` (isi verbatim + keterangan asal-usul dan</w:t>
+      </w:r>
+    </w:p>
+    <w:p>
+      <w:r>
+        <w:t xml:space="preserve">  peringatan bahwa klaim di dalamnya bukan bukti).</w:t>
+      </w:r>
+    </w:p>
+    <w:p>
+      <w:pPr>
+        <w:pStyle w:val="ListBullet"/>
+      </w:pPr>
+      <w:r>
+        <w:t>`docs/log-mentah/2026-10-06-prompt-claude-ui-baru.md` (prompt verbatim).</w:t>
+      </w:r>
+    </w:p>
+    <w:p>
+      <w:pPr>
+        <w:pStyle w:val="ListBullet"/>
+      </w:pPr>
+      <w:r>
+        <w:t>`export-word.sh` diperbarui (`PROMPT_V3`) sehingga prompt itu ikut ke `docs/word/AGENT.docx` +</w:t>
+      </w:r>
+    </w:p>
+    <w:p>
+      <w:r>
+        <w:t xml:space="preserve">  `AGENT.md` dan diarsipkan sebagai `docs/word-arsip/(ARSIP) prompt-claude.docx`.</w:t>
+      </w:r>
+    </w:p>
+    <w:p>
+      <w:pPr>
+        <w:pStyle w:val="ListBullet"/>
+      </w:pPr>
+      <w:r>
+        <w:t>`log-mentah.docx` otomatis memuat kedua berkas `.md` itu; sudah diverifikasi dengan membaca</w:t>
+      </w:r>
+    </w:p>
+    <w:p>
+      <w:r>
+        <w:t xml:space="preserve">  `word/document.xml` hasil ekspor.</w:t>
+      </w:r>
+    </w:p>
+    <w:p>
+      <w:pPr>
+        <w:pStyle w:val="ListBullet"/>
+      </w:pPr>
+      <w:r>
+        <w:t>Berkas `.txt` asli **tidak dihapus** (disimpan sebagai jejak berkas penanda).</w:t>
+      </w:r>
+    </w:p>
+    <w:p>
+      <w:r/>
+    </w:p>
+    <w:p>
+      <w:pPr>
+        <w:pStyle w:val="Heading3"/>
+      </w:pPr>
+      <w:r>
+        <w:t>2) Berkas uji frontend dipusatkan</w:t>
+      </w:r>
+    </w:p>
+    <w:p>
+      <w:r/>
+    </w:p>
+    <w:p>
+      <w:r>
+        <w:t>25 berkas `*.test.js(x)` yang tadinya di samping berkas sumber dipindahkan ke</w:t>
+      </w:r>
+    </w:p>
+    <w:p>
+      <w:r>
+        <w:t>`frontend/src/__tests__/` mengikuti struktur `src/`. Impor relatif (termasuk `vi.mock` dan</w:t>
+      </w:r>
+    </w:p>
+    <w:p>
+      <w:r>
+        <w:t>`import('./…')` di JSDoc) diperbaiki otomatis; `import.meta.glob` pada `theme/tema.test.js`</w:t>
+      </w:r>
+    </w:p>
+    <w:p>
+      <w:r>
+        <w:t>diganti ke `'../../**/*.{js,jsx,css}'`. `jsconfig.json` tidak perlu diubah (`include: ["src"]`).</w:t>
+      </w:r>
+    </w:p>
+    <w:p>
+      <w:r>
+        <w:t>Hasil: checkJs OK, ESLint 0 error (2 warning lama), Vitest tetap 25 berkas / 156 test,</w:t>
+      </w:r>
+    </w:p>
+    <w:p>
+      <w:r>
+        <w:t>`./verify.sh` SEMUA HIJAU (Pest 79 passed / 491 assertions, Pint 166 files, realtime 2).</w:t>
+      </w:r>
+    </w:p>
+    <w:p>
+      <w:r>
+        <w:t>Skrip pemindahan bersifat sekali pakai dan sudah dihapus dari repo.</w:t>
+      </w:r>
+    </w:p>
+    <w:p>
+      <w:r/>
+    </w:p>
+    <w:p>
+      <w:pPr>
+        <w:pStyle w:val="Heading3"/>
+      </w:pPr>
+      <w:r>
+        <w:t>3) Fitur MVP yang belum — menunggu konfirmasi cakupan</w:t>
+      </w:r>
+    </w:p>
+    <w:p>
+      <w:r/>
+    </w:p>
+    <w:p>
+      <w:r>
+        <w:t>Slice 06–10 (koreksi manual isian/uraian, anti-cheat + presence + Live Monitor SSE, materi/layar</w:t>
+      </w:r>
+    </w:p>
+    <w:p>
+      <w:r>
+        <w:t>guru/avatar, upload jawaban + penilaian AI + mode tim, cache/mode gelap/Octane/deploy) belum</w:t>
+      </w:r>
+    </w:p>
+    <w:p>
+      <w:r>
+        <w:t>dikerjakan. Pekerjaan itu jauh lebih besar dari satu putaran kerja, jadi cakupan MVP-nya</w:t>
+      </w:r>
+    </w:p>
+    <w:p>
+      <w:r>
+        <w:t>dikonfirmasi lebih dulu ke pengguna (termasuk deploy yang butuh akun hosting) sebelum ditulis.</w:t>
       </w:r>
     </w:p>
     <w:sectPr>

</xml_diff>